<commit_message>
Integrate EI-by-participant-gender subsection into storyline draft
https://claude.ai/code/session_01L68e4qRUQ3XwBSVpuorTML
</commit_message>
<xml_diff>
--- a/analysis/22_storyline_draft.docx
+++ b/analysis/22_storyline_draft.docx
@@ -258,6 +258,30 @@
       </w:pPr>
       <w:r>
         <w:t>A further analysis confirms that the gender effect in these data is a congruity interaction rather than a simple main-effect funding gap. When allocations are collapsed to a raw male- versus female-founded comparison, the difference is non-significant (p = .257), and emotional intelligence does not moderate it (omnibus interaction p = .705). The bias surfaces only in the founder-by-industry congruity cells, which is exactly where Results 2 and 3 locate it. The locus of emotional intelligence’s influence is congruity, not raw founder gender — a finding with direct practical implication: improving investors’ emotional competencies may attenuate gender-congruity bias in capital allocation.</w:t>
+      </w:r>
+    </w:p>
+    <w:p>
+      <w:pPr>
+        <w:pStyle w:val="Heading2"/>
+      </w:pPr>
+      <w:r>
+        <w:t>Emotional Intelligence by Participant Gender</w:t>
+      </w:r>
+    </w:p>
+    <w:p>
+      <w:pPr>
+        <w:spacing w:line="360" w:lineRule="auto"/>
+      </w:pPr>
+      <w:r>
+        <w:t>Because emotional intelligence is the central individual-difference variable in this study, gender differences in the WLEIS were examined before interpreting the substantive results. Female participants (n = 100) reported significantly higher total emotional intelligence than male participants (n = 84), M = 5.32 (SD = 0.77) versus M = 4.97 (SD = 0.71), Welch t(182) = 3.19, p = .002, d = 0.47. The difference was concentrated in the two appraisal dimensions: self-emotion appraisal (SEA), M = 5.46 vs. 4.83, p &lt; .001, d = 0.59, and others’ emotion appraisal (OEA), M = 5.74 vs. 5.05, p &lt; .001, d = 0.66. The use of emotion (UOE; p = .206) and regulation of emotion (ROE; p = .462) dimensions did not differ by gender.</w:t>
+      </w:r>
+    </w:p>
+    <w:p>
+      <w:pPr>
+        <w:spacing w:line="360" w:lineRule="auto"/>
+      </w:pPr>
+      <w:r>
+        <w:t>The effect was robust to demographic controls. Regressing each WLEIS score on participant gender while adjusting for age and field of study (STEM vs. non-STEM) left the gender difference unchanged for total EI (b = 0.36, p = .002), SEA (b = 0.65, p &lt; .001), and OEA (b = 0.66, p &lt; .001). The samples were well matched on age (M = 23.6 vs. 23.3 years) and comparable in STEM enrolment (13% vs. 23%), so the difference reflects gender rather than these covariates. This pattern is consistent with the broader emotional-intelligence literature, in which women score higher on perceiving and appraising emotions while regulation and instrumental-use differences are small or absent. Methodologically, because emotional intelligence is correlated with participant gender, tests of whether its moderating role differs between male and female participants operate on a restricted EI range within each gender and are correspondingly less sensitive — a limitation noted where relevant.</w:t>
       </w:r>
     </w:p>
     <w:sectPr>

</xml_diff>